<commit_message>
matlab lab 6 and 6
</commit_message>
<xml_diff>
--- a/Matlab/lab 7/отчет.docx
+++ b/Matlab/lab 7/отчет.docx
@@ -3445,6 +3445,7 @@
       <w:r>
         <w:rPr>
           <w:rFonts w:eastAsia="Times New Roman" w:cs="Times New Roman"/>
+          <w:noProof/>
           <w:color w:val="00000A"/>
           <w:szCs w:val="24"/>
           <w:lang w:val="en-US" w:eastAsia="ru-RU"/>
@@ -3496,7 +3497,7 @@
           <w:rFonts w:eastAsia="Times New Roman" w:cs="Times New Roman"/>
           <w:color w:val="00000A"/>
           <w:szCs w:val="24"/>
-          <w:lang w:val="en-US" w:eastAsia="ru-RU"/>
+          <w:lang w:eastAsia="ru-RU"/>
         </w:rPr>
       </w:pPr>
       <w:r>
@@ -4120,7 +4121,7 @@
           <w:rFonts w:eastAsia="Times New Roman" w:cs="Times New Roman"/>
           <w:color w:val="00000A"/>
           <w:szCs w:val="24"/>
-          <w:lang w:val="en-US" w:eastAsia="ru-RU"/>
+          <w:lang w:eastAsia="ru-RU"/>
         </w:rPr>
       </w:pPr>
     </w:p>
@@ -4133,7 +4134,7 @@
           <w:rFonts w:eastAsia="Times New Roman" w:cs="Times New Roman"/>
           <w:color w:val="00000A"/>
           <w:szCs w:val="24"/>
-          <w:lang w:val="en-US" w:eastAsia="ru-RU"/>
+          <w:lang w:eastAsia="ru-RU"/>
         </w:rPr>
       </w:pPr>
       <w:r>
@@ -4178,7 +4179,7 @@
           <w:rFonts w:eastAsia="Times New Roman" w:cs="Times New Roman"/>
           <w:color w:val="00000A"/>
           <w:szCs w:val="24"/>
-          <w:lang w:val="en-US" w:eastAsia="ru-RU"/>
+          <w:lang w:eastAsia="ru-RU"/>
         </w:rPr>
       </w:pPr>
       <w:r>
@@ -4195,7 +4196,7 @@
           <w:rFonts w:eastAsia="Times New Roman" w:cs="Times New Roman"/>
           <w:color w:val="00000A"/>
           <w:szCs w:val="24"/>
-          <w:lang w:val="en-US" w:eastAsia="ru-RU"/>
+          <w:lang w:eastAsia="ru-RU"/>
         </w:rPr>
         <w:t>:</w:t>
       </w:r>
@@ -5007,7 +5008,7 @@
           <w:rFonts w:eastAsia="Times New Roman" w:cs="Times New Roman"/>
           <w:color w:val="00000A"/>
           <w:szCs w:val="24"/>
-          <w:lang w:val="en-US" w:eastAsia="ru-RU"/>
+          <w:lang w:eastAsia="ru-RU"/>
         </w:rPr>
       </w:pPr>
       <w:r>
@@ -5075,7 +5076,7 @@
           <w:rFonts w:eastAsia="Times New Roman" w:cs="Times New Roman"/>
           <w:color w:val="00000A"/>
           <w:szCs w:val="24"/>
-          <w:lang w:val="en-US" w:eastAsia="ru-RU"/>
+          <w:lang w:eastAsia="ru-RU"/>
         </w:rPr>
       </w:pPr>
       <w:r>
@@ -5143,7 +5144,7 @@
           <w:rFonts w:eastAsia="Times New Roman" w:cs="Times New Roman"/>
           <w:color w:val="00000A"/>
           <w:szCs w:val="24"/>
-          <w:lang w:val="en-US" w:eastAsia="ru-RU"/>
+          <w:lang w:eastAsia="ru-RU"/>
         </w:rPr>
       </w:pPr>
       <w:r>
@@ -5224,7 +5225,7 @@
           <w:rFonts w:eastAsia="Times New Roman" w:cs="Times New Roman"/>
           <w:color w:val="00000A"/>
           <w:szCs w:val="24"/>
-          <w:lang w:val="en-US" w:eastAsia="ru-RU"/>
+          <w:lang w:eastAsia="ru-RU"/>
         </w:rPr>
       </w:pPr>
       <w:r>
@@ -5268,7 +5269,7 @@
           <w:rFonts w:eastAsia="Times New Roman" w:cs="Times New Roman"/>
           <w:color w:val="00000A"/>
           <w:szCs w:val="24"/>
-          <w:lang w:val="en-US" w:eastAsia="ru-RU"/>
+          <w:lang w:eastAsia="ru-RU"/>
         </w:rPr>
       </w:pPr>
       <w:r>
@@ -5326,26 +5327,17 @@
           <m:t>(3.5) = 1542.67</m:t>
         </m:r>
       </m:oMath>
-      <w:r>
-        <w:rPr>
-          <w:rFonts w:eastAsia="Times New Roman" w:cs="Times New Roman"/>
-          <w:color w:val="00000A"/>
-          <w:szCs w:val="24"/>
-          <w:lang w:eastAsia="ru-RU"/>
-        </w:rPr>
-        <w:t>$</w:t>
-      </w:r>
-    </w:p>
-    <w:p>
-      <w:pPr>
-        <w:suppressAutoHyphens/>
-        <w:spacing w:after="200" w:line="240" w:lineRule="auto"/>
-        <w:ind w:firstLine="0"/>
-        <w:rPr>
-          <w:rFonts w:eastAsia="Times New Roman" w:cs="Times New Roman"/>
-          <w:color w:val="00000A"/>
-          <w:szCs w:val="24"/>
-          <w:lang w:val="en-US" w:eastAsia="ru-RU"/>
+    </w:p>
+    <w:p>
+      <w:pPr>
+        <w:suppressAutoHyphens/>
+        <w:spacing w:after="200" w:line="240" w:lineRule="auto"/>
+        <w:ind w:firstLine="0"/>
+        <w:rPr>
+          <w:rFonts w:eastAsia="Times New Roman" w:cs="Times New Roman"/>
+          <w:color w:val="00000A"/>
+          <w:szCs w:val="24"/>
+          <w:lang w:eastAsia="ru-RU"/>
         </w:rPr>
       </w:pPr>
       <w:r>
@@ -5403,15 +5395,6 @@
           <m:t>(6.7) = 2559.88</m:t>
         </m:r>
       </m:oMath>
-      <w:r>
-        <w:rPr>
-          <w:rFonts w:eastAsia="Times New Roman" w:cs="Times New Roman"/>
-          <w:color w:val="00000A"/>
-          <w:szCs w:val="24"/>
-          <w:lang w:eastAsia="ru-RU"/>
-        </w:rPr>
-        <w:t>$</w:t>
-      </w:r>
     </w:p>
     <w:p>
       <w:pPr>
@@ -5480,15 +5463,6 @@
           <m:t>(12.4) = 3250.32</m:t>
         </m:r>
       </m:oMath>
-      <w:r>
-        <w:rPr>
-          <w:rFonts w:eastAsia="Times New Roman" w:cs="Times New Roman"/>
-          <w:color w:val="00000A"/>
-          <w:szCs w:val="24"/>
-          <w:lang w:eastAsia="ru-RU"/>
-        </w:rPr>
-        <w:t>$</w:t>
-      </w:r>
     </w:p>
     <w:p>
       <w:pPr>
@@ -5585,6 +5559,7 @@
       <w:r>
         <w:rPr>
           <w:rFonts w:eastAsia="Times New Roman" w:cs="Times New Roman"/>
+          <w:noProof/>
           <w:color w:val="00000A"/>
           <w:szCs w:val="24"/>
           <w:lang w:val="en-US" w:eastAsia="ru-RU"/>
@@ -5737,7 +5712,7 @@
           <w:rFonts w:eastAsia="Times New Roman" w:cs="Times New Roman"/>
           <w:color w:val="00000A"/>
           <w:szCs w:val="24"/>
-          <w:lang w:val="en-US" w:eastAsia="ru-RU"/>
+          <w:lang w:eastAsia="ru-RU"/>
         </w:rPr>
       </w:pPr>
       <w:r>
@@ -6944,7 +6919,7 @@
           <w:rFonts w:eastAsia="Times New Roman" w:cs="Times New Roman"/>
           <w:color w:val="00000A"/>
           <w:szCs w:val="24"/>
-          <w:lang w:val="en-US" w:eastAsia="ru-RU"/>
+          <w:lang w:eastAsia="ru-RU"/>
         </w:rPr>
       </w:pPr>
       <w:proofErr w:type="spellStart"/>
@@ -6964,7 +6939,7 @@
           <w:rFonts w:eastAsia="Times New Roman" w:cs="Times New Roman"/>
           <w:color w:val="00000A"/>
           <w:szCs w:val="24"/>
-          <w:lang w:val="en-US" w:eastAsia="ru-RU"/>
+          <w:lang w:eastAsia="ru-RU"/>
         </w:rPr>
         <w:t>(</w:t>
       </w:r>
@@ -6974,49 +6949,100 @@
           <w:rFonts w:eastAsia="Times New Roman" w:cs="Times New Roman"/>
           <w:color w:val="00000A"/>
           <w:szCs w:val="24"/>
-          <w:lang w:val="en-US" w:eastAsia="ru-RU"/>
-        </w:rPr>
-        <w:t>'</w:t>
-      </w:r>
-      <w:proofErr w:type="spellStart"/>
-      <w:r>
-        <w:rPr>
-          <w:rFonts w:eastAsia="Times New Roman" w:cs="Times New Roman"/>
-          <w:color w:val="00000A"/>
-          <w:szCs w:val="24"/>
-          <w:lang w:val="en-US" w:eastAsia="ru-RU"/>
-        </w:rPr>
-        <w:t>Проверка</w:t>
-      </w:r>
-      <w:proofErr w:type="spellEnd"/>
-      <w:r>
-        <w:rPr>
-          <w:rFonts w:eastAsia="Times New Roman" w:cs="Times New Roman"/>
-          <w:color w:val="00000A"/>
-          <w:szCs w:val="24"/>
-          <w:lang w:val="en-US" w:eastAsia="ru-RU"/>
-        </w:rPr>
-        <w:t xml:space="preserve"> </w:t>
-      </w:r>
-      <w:proofErr w:type="spellStart"/>
-      <w:r>
-        <w:rPr>
-          <w:rFonts w:eastAsia="Times New Roman" w:cs="Times New Roman"/>
-          <w:color w:val="00000A"/>
-          <w:szCs w:val="24"/>
-          <w:lang w:val="en-US" w:eastAsia="ru-RU"/>
-        </w:rPr>
-        <w:t>обусловленности</w:t>
-      </w:r>
-      <w:proofErr w:type="spellEnd"/>
-      <w:r>
-        <w:rPr>
-          <w:rFonts w:eastAsia="Times New Roman" w:cs="Times New Roman"/>
-          <w:color w:val="00000A"/>
-          <w:szCs w:val="24"/>
-          <w:lang w:val="en-US" w:eastAsia="ru-RU"/>
-        </w:rPr>
-        <w:t xml:space="preserve">: %d', </w:t>
+          <w:lang w:eastAsia="ru-RU"/>
+        </w:rPr>
+        <w:t>'Проверка обусловленности: %</w:t>
+      </w:r>
+      <w:r>
+        <w:rPr>
+          <w:rFonts w:eastAsia="Times New Roman" w:cs="Times New Roman"/>
+          <w:color w:val="00000A"/>
+          <w:szCs w:val="24"/>
+          <w:lang w:val="en-US" w:eastAsia="ru-RU"/>
+        </w:rPr>
+        <w:t>d</w:t>
+      </w:r>
+      <w:r>
+        <w:rPr>
+          <w:rFonts w:eastAsia="Times New Roman" w:cs="Times New Roman"/>
+          <w:color w:val="00000A"/>
+          <w:szCs w:val="24"/>
+          <w:lang w:eastAsia="ru-RU"/>
+        </w:rPr>
+        <w:t xml:space="preserve">', </w:t>
+      </w:r>
+      <w:proofErr w:type="spellStart"/>
+      <w:r>
+        <w:rPr>
+          <w:rFonts w:eastAsia="Times New Roman" w:cs="Times New Roman"/>
+          <w:color w:val="00000A"/>
+          <w:szCs w:val="24"/>
+          <w:lang w:val="en-US" w:eastAsia="ru-RU"/>
+        </w:rPr>
+        <w:t>cond</w:t>
+      </w:r>
+      <w:proofErr w:type="spellEnd"/>
+      <w:r>
+        <w:rPr>
+          <w:rFonts w:eastAsia="Times New Roman" w:cs="Times New Roman"/>
+          <w:color w:val="00000A"/>
+          <w:szCs w:val="24"/>
+          <w:lang w:eastAsia="ru-RU"/>
+        </w:rPr>
+        <w:t>_</w:t>
+      </w:r>
+      <w:r>
+        <w:rPr>
+          <w:rFonts w:eastAsia="Times New Roman" w:cs="Times New Roman"/>
+          <w:color w:val="00000A"/>
+          <w:szCs w:val="24"/>
+          <w:lang w:val="en-US" w:eastAsia="ru-RU"/>
+        </w:rPr>
+        <w:t>number</w:t>
+      </w:r>
+      <w:r>
+        <w:rPr>
+          <w:rFonts w:eastAsia="Times New Roman" w:cs="Times New Roman"/>
+          <w:color w:val="00000A"/>
+          <w:szCs w:val="24"/>
+          <w:lang w:eastAsia="ru-RU"/>
+        </w:rPr>
+        <w:t>)</w:t>
+      </w:r>
+    </w:p>
+    <w:p>
+      <w:pPr>
+        <w:suppressAutoHyphens/>
+        <w:spacing w:after="200" w:line="240" w:lineRule="auto"/>
+        <w:ind w:firstLine="0"/>
+        <w:rPr>
+          <w:rFonts w:eastAsia="Times New Roman" w:cs="Times New Roman"/>
+          <w:color w:val="00000A"/>
+          <w:szCs w:val="24"/>
+          <w:lang w:eastAsia="ru-RU"/>
+        </w:rPr>
+      </w:pPr>
+    </w:p>
+    <w:p>
+      <w:pPr>
+        <w:suppressAutoHyphens/>
+        <w:spacing w:after="200" w:line="240" w:lineRule="auto"/>
+        <w:ind w:firstLine="0"/>
+        <w:rPr>
+          <w:rFonts w:eastAsia="Times New Roman" w:cs="Times New Roman"/>
+          <w:color w:val="00000A"/>
+          <w:szCs w:val="24"/>
+          <w:lang w:val="en-US" w:eastAsia="ru-RU"/>
+        </w:rPr>
+      </w:pPr>
+      <w:r>
+        <w:rPr>
+          <w:rFonts w:eastAsia="Times New Roman" w:cs="Times New Roman"/>
+          <w:color w:val="00000A"/>
+          <w:szCs w:val="24"/>
+          <w:lang w:val="en-US" w:eastAsia="ru-RU"/>
+        </w:rPr>
+        <w:t xml:space="preserve">if </w:t>
       </w:r>
       <w:proofErr w:type="spellStart"/>
       <w:r>
@@ -7036,61 +7062,6 @@
           <w:szCs w:val="24"/>
           <w:lang w:val="en-US" w:eastAsia="ru-RU"/>
         </w:rPr>
-        <w:t>)</w:t>
-      </w:r>
-    </w:p>
-    <w:p>
-      <w:pPr>
-        <w:suppressAutoHyphens/>
-        <w:spacing w:after="200" w:line="240" w:lineRule="auto"/>
-        <w:ind w:firstLine="0"/>
-        <w:rPr>
-          <w:rFonts w:eastAsia="Times New Roman" w:cs="Times New Roman"/>
-          <w:color w:val="00000A"/>
-          <w:szCs w:val="24"/>
-          <w:lang w:val="en-US" w:eastAsia="ru-RU"/>
-        </w:rPr>
-      </w:pPr>
-    </w:p>
-    <w:p>
-      <w:pPr>
-        <w:suppressAutoHyphens/>
-        <w:spacing w:after="200" w:line="240" w:lineRule="auto"/>
-        <w:ind w:firstLine="0"/>
-        <w:rPr>
-          <w:rFonts w:eastAsia="Times New Roman" w:cs="Times New Roman"/>
-          <w:color w:val="00000A"/>
-          <w:szCs w:val="24"/>
-          <w:lang w:val="en-US" w:eastAsia="ru-RU"/>
-        </w:rPr>
-      </w:pPr>
-      <w:r>
-        <w:rPr>
-          <w:rFonts w:eastAsia="Times New Roman" w:cs="Times New Roman"/>
-          <w:color w:val="00000A"/>
-          <w:szCs w:val="24"/>
-          <w:lang w:val="en-US" w:eastAsia="ru-RU"/>
-        </w:rPr>
-        <w:t xml:space="preserve">if </w:t>
-      </w:r>
-      <w:proofErr w:type="spellStart"/>
-      <w:r>
-        <w:rPr>
-          <w:rFonts w:eastAsia="Times New Roman" w:cs="Times New Roman"/>
-          <w:color w:val="00000A"/>
-          <w:szCs w:val="24"/>
-          <w:lang w:val="en-US" w:eastAsia="ru-RU"/>
-        </w:rPr>
-        <w:t>cond_number</w:t>
-      </w:r>
-      <w:proofErr w:type="spellEnd"/>
-      <w:r>
-        <w:rPr>
-          <w:rFonts w:eastAsia="Times New Roman" w:cs="Times New Roman"/>
-          <w:color w:val="00000A"/>
-          <w:szCs w:val="24"/>
-          <w:lang w:val="en-US" w:eastAsia="ru-RU"/>
-        </w:rPr>
         <w:t xml:space="preserve"> &lt; 1e4</w:t>
       </w:r>
     </w:p>
@@ -7103,7 +7074,7 @@
           <w:rFonts w:eastAsia="Times New Roman" w:cs="Times New Roman"/>
           <w:color w:val="00000A"/>
           <w:szCs w:val="24"/>
-          <w:lang w:val="en-US" w:eastAsia="ru-RU"/>
+          <w:lang w:eastAsia="ru-RU"/>
         </w:rPr>
       </w:pPr>
       <w:r>
@@ -7132,7 +7103,7 @@
           <w:rFonts w:eastAsia="Times New Roman" w:cs="Times New Roman"/>
           <w:color w:val="00000A"/>
           <w:szCs w:val="24"/>
-          <w:lang w:val="en-US" w:eastAsia="ru-RU"/>
+          <w:lang w:eastAsia="ru-RU"/>
         </w:rPr>
         <w:t>(</w:t>
       </w:r>
@@ -7142,69 +7113,27 @@
           <w:rFonts w:eastAsia="Times New Roman" w:cs="Times New Roman"/>
           <w:color w:val="00000A"/>
           <w:szCs w:val="24"/>
-          <w:lang w:val="en-US" w:eastAsia="ru-RU"/>
-        </w:rPr>
-        <w:t>'</w:t>
-      </w:r>
-      <w:proofErr w:type="spellStart"/>
-      <w:r>
-        <w:rPr>
-          <w:rFonts w:eastAsia="Times New Roman" w:cs="Times New Roman"/>
-          <w:color w:val="00000A"/>
-          <w:szCs w:val="24"/>
-          <w:lang w:val="en-US" w:eastAsia="ru-RU"/>
-        </w:rPr>
-        <w:t>Статус</w:t>
-      </w:r>
-      <w:proofErr w:type="spellEnd"/>
-      <w:r>
-        <w:rPr>
-          <w:rFonts w:eastAsia="Times New Roman" w:cs="Times New Roman"/>
-          <w:color w:val="00000A"/>
-          <w:szCs w:val="24"/>
-          <w:lang w:val="en-US" w:eastAsia="ru-RU"/>
-        </w:rPr>
-        <w:t xml:space="preserve">: </w:t>
-      </w:r>
-      <w:proofErr w:type="spellStart"/>
-      <w:r>
-        <w:rPr>
-          <w:rFonts w:eastAsia="Times New Roman" w:cs="Times New Roman"/>
-          <w:color w:val="00000A"/>
-          <w:szCs w:val="24"/>
-          <w:lang w:val="en-US" w:eastAsia="ru-RU"/>
-        </w:rPr>
-        <w:t>Хорошо</w:t>
-      </w:r>
-      <w:proofErr w:type="spellEnd"/>
-      <w:r>
-        <w:rPr>
-          <w:rFonts w:eastAsia="Times New Roman" w:cs="Times New Roman"/>
-          <w:color w:val="00000A"/>
-          <w:szCs w:val="24"/>
-          <w:lang w:val="en-US" w:eastAsia="ru-RU"/>
-        </w:rPr>
-        <w:t xml:space="preserve"> </w:t>
-      </w:r>
-      <w:proofErr w:type="spellStart"/>
-      <w:r>
-        <w:rPr>
-          <w:rFonts w:eastAsia="Times New Roman" w:cs="Times New Roman"/>
-          <w:color w:val="00000A"/>
-          <w:szCs w:val="24"/>
-          <w:lang w:val="en-US" w:eastAsia="ru-RU"/>
-        </w:rPr>
-        <w:t>обусловлена</w:t>
-      </w:r>
-      <w:proofErr w:type="spellEnd"/>
-      <w:r>
-        <w:rPr>
-          <w:rFonts w:eastAsia="Times New Roman" w:cs="Times New Roman"/>
-          <w:color w:val="00000A"/>
-          <w:szCs w:val="24"/>
-          <w:lang w:val="en-US" w:eastAsia="ru-RU"/>
-        </w:rPr>
-        <w:t xml:space="preserve"> \n');</w:t>
+          <w:lang w:eastAsia="ru-RU"/>
+        </w:rPr>
+        <w:t>'Статус: Хорошо обусловлена \</w:t>
+      </w:r>
+      <w:r>
+        <w:rPr>
+          <w:rFonts w:eastAsia="Times New Roman" w:cs="Times New Roman"/>
+          <w:color w:val="00000A"/>
+          <w:szCs w:val="24"/>
+          <w:lang w:val="en-US" w:eastAsia="ru-RU"/>
+        </w:rPr>
+        <w:t>n</w:t>
+      </w:r>
+      <w:r>
+        <w:rPr>
+          <w:rFonts w:eastAsia="Times New Roman" w:cs="Times New Roman"/>
+          <w:color w:val="00000A"/>
+          <w:szCs w:val="24"/>
+          <w:lang w:eastAsia="ru-RU"/>
+        </w:rPr>
+        <w:t>');</w:t>
       </w:r>
     </w:p>
     <w:p>
@@ -9847,7 +9776,7 @@
           <w:rFonts w:eastAsia="Times New Roman" w:cs="Times New Roman"/>
           <w:color w:val="00000A"/>
           <w:szCs w:val="24"/>
-          <w:lang w:eastAsia="ru-RU"/>
+          <w:lang w:val="en-US" w:eastAsia="ru-RU"/>
         </w:rPr>
       </w:pPr>
       <w:r>
@@ -9864,7 +9793,7 @@
           <w:rFonts w:eastAsia="Times New Roman" w:cs="Times New Roman"/>
           <w:color w:val="00000A"/>
           <w:szCs w:val="24"/>
-          <w:lang w:eastAsia="ru-RU"/>
+          <w:lang w:val="en-US" w:eastAsia="ru-RU"/>
         </w:rPr>
         <w:t>_</w:t>
       </w:r>
@@ -9882,7 +9811,7 @@
           <w:rFonts w:eastAsia="Times New Roman" w:cs="Times New Roman"/>
           <w:color w:val="00000A"/>
           <w:szCs w:val="24"/>
-          <w:lang w:eastAsia="ru-RU"/>
+          <w:lang w:val="en-US" w:eastAsia="ru-RU"/>
         </w:rPr>
         <w:t>1_</w:t>
       </w:r>
@@ -9900,7 +9829,7 @@
           <w:rFonts w:eastAsia="Times New Roman" w:cs="Times New Roman"/>
           <w:color w:val="00000A"/>
           <w:szCs w:val="24"/>
-          <w:lang w:eastAsia="ru-RU"/>
+          <w:lang w:val="en-US" w:eastAsia="ru-RU"/>
         </w:rPr>
         <w:t xml:space="preserve"> = </w:t>
       </w:r>
@@ -9919,7 +9848,7 @@
           <w:rFonts w:eastAsia="Times New Roman" w:cs="Times New Roman"/>
           <w:color w:val="00000A"/>
           <w:szCs w:val="24"/>
-          <w:lang w:eastAsia="ru-RU"/>
+          <w:lang w:val="en-US" w:eastAsia="ru-RU"/>
         </w:rPr>
         <w:t>(</w:t>
       </w:r>
@@ -9937,7 +9866,7 @@
           <w:rFonts w:eastAsia="Times New Roman" w:cs="Times New Roman"/>
           <w:color w:val="00000A"/>
           <w:szCs w:val="24"/>
-          <w:lang w:eastAsia="ru-RU"/>
+          <w:lang w:val="en-US" w:eastAsia="ru-RU"/>
         </w:rPr>
         <w:t>(</w:t>
       </w:r>
@@ -9955,7 +9884,7 @@
           <w:rFonts w:eastAsia="Times New Roman" w:cs="Times New Roman"/>
           <w:color w:val="00000A"/>
           <w:szCs w:val="24"/>
-          <w:lang w:eastAsia="ru-RU"/>
+          <w:lang w:val="en-US" w:eastAsia="ru-RU"/>
         </w:rPr>
         <w:t>(</w:t>
       </w:r>
@@ -9974,7 +9903,7 @@
           <w:rFonts w:eastAsia="Times New Roman" w:cs="Times New Roman"/>
           <w:color w:val="00000A"/>
           <w:szCs w:val="24"/>
-          <w:lang w:eastAsia="ru-RU"/>
+          <w:lang w:val="en-US" w:eastAsia="ru-RU"/>
         </w:rPr>
         <w:t xml:space="preserve">, </w:t>
       </w:r>
@@ -9992,10 +9921,11 @@
           <w:rFonts w:eastAsia="Times New Roman" w:cs="Times New Roman"/>
           <w:color w:val="00000A"/>
           <w:szCs w:val="24"/>
-          <w:lang w:eastAsia="ru-RU"/>
+          <w:lang w:val="en-US" w:eastAsia="ru-RU"/>
         </w:rPr>
         <w:t>+1))) / (</w:t>
       </w:r>
+      <w:proofErr w:type="spellStart"/>
       <w:r>
         <w:rPr>
           <w:rFonts w:eastAsia="Times New Roman" w:cs="Times New Roman"/>
@@ -10010,7 +9940,7 @@
           <w:rFonts w:eastAsia="Times New Roman" w:cs="Times New Roman"/>
           <w:color w:val="00000A"/>
           <w:szCs w:val="24"/>
-          <w:lang w:eastAsia="ru-RU"/>
+          <w:lang w:val="en-US" w:eastAsia="ru-RU"/>
         </w:rPr>
         <w:t>_</w:t>
       </w:r>
@@ -10023,12 +9953,13 @@
         </w:rPr>
         <w:t>step</w:t>
       </w:r>
-      <w:r>
-        <w:rPr>
-          <w:rFonts w:eastAsia="Times New Roman" w:cs="Times New Roman"/>
-          <w:color w:val="00000A"/>
-          <w:szCs w:val="24"/>
-          <w:lang w:eastAsia="ru-RU"/>
+      <w:proofErr w:type="spellEnd"/>
+      <w:r>
+        <w:rPr>
+          <w:rFonts w:eastAsia="Times New Roman" w:cs="Times New Roman"/>
+          <w:color w:val="00000A"/>
+          <w:szCs w:val="24"/>
+          <w:lang w:val="en-US" w:eastAsia="ru-RU"/>
         </w:rPr>
         <w:t>^(</w:t>
       </w:r>
@@ -10046,7 +9977,7 @@
           <w:rFonts w:eastAsia="Times New Roman" w:cs="Times New Roman"/>
           <w:color w:val="00000A"/>
           <w:szCs w:val="24"/>
-          <w:lang w:eastAsia="ru-RU"/>
+          <w:lang w:val="en-US" w:eastAsia="ru-RU"/>
         </w:rPr>
         <w:t>+1));</w:t>
       </w:r>
@@ -10060,7 +9991,7 @@
           <w:rFonts w:eastAsia="Times New Roman" w:cs="Times New Roman"/>
           <w:color w:val="00000A"/>
           <w:szCs w:val="24"/>
-          <w:lang w:eastAsia="ru-RU"/>
+          <w:lang w:val="en-US" w:eastAsia="ru-RU"/>
         </w:rPr>
       </w:pPr>
     </w:p>
@@ -10376,7 +10307,27 @@
           <w:szCs w:val="24"/>
           <w:lang w:val="en-US" w:eastAsia="ru-RU"/>
         </w:rPr>
-        <w:t xml:space="preserve">for i = </w:t>
+        <w:t xml:space="preserve">for </w:t>
+      </w:r>
+      <w:proofErr w:type="spellStart"/>
+      <w:r>
+        <w:rPr>
+          <w:rFonts w:eastAsia="Times New Roman" w:cs="Times New Roman"/>
+          <w:color w:val="00000A"/>
+          <w:szCs w:val="24"/>
+          <w:lang w:val="en-US" w:eastAsia="ru-RU"/>
+        </w:rPr>
+        <w:t>i</w:t>
+      </w:r>
+      <w:proofErr w:type="spellEnd"/>
+      <w:r>
+        <w:rPr>
+          <w:rFonts w:eastAsia="Times New Roman" w:cs="Times New Roman"/>
+          <w:color w:val="00000A"/>
+          <w:szCs w:val="24"/>
+          <w:lang w:val="en-US" w:eastAsia="ru-RU"/>
+        </w:rPr>
+        <w:t xml:space="preserve"> = </w:t>
       </w:r>
       <w:proofErr w:type="gramStart"/>
       <w:r>
@@ -12345,9 +12296,10 @@
           <w:rFonts w:eastAsia="Times New Roman" w:cs="Times New Roman"/>
           <w:color w:val="00000A"/>
           <w:szCs w:val="24"/>
-          <w:lang w:eastAsia="ru-RU"/>
-        </w:rPr>
-      </w:pPr>
+          <w:lang w:val="en-US" w:eastAsia="ru-RU"/>
+        </w:rPr>
+      </w:pPr>
+      <w:proofErr w:type="spellStart"/>
       <w:r>
         <w:rPr>
           <w:rFonts w:eastAsia="Times New Roman" w:cs="Times New Roman"/>
@@ -12362,7 +12314,7 @@
           <w:rFonts w:eastAsia="Times New Roman" w:cs="Times New Roman"/>
           <w:color w:val="00000A"/>
           <w:szCs w:val="24"/>
-          <w:lang w:eastAsia="ru-RU"/>
+          <w:lang w:val="en-US" w:eastAsia="ru-RU"/>
         </w:rPr>
         <w:t>_</w:t>
       </w:r>
@@ -12375,12 +12327,13 @@
         </w:rPr>
         <w:t>obj</w:t>
       </w:r>
-      <w:r>
-        <w:rPr>
-          <w:rFonts w:eastAsia="Times New Roman" w:cs="Times New Roman"/>
-          <w:color w:val="00000A"/>
-          <w:szCs w:val="24"/>
-          <w:lang w:eastAsia="ru-RU"/>
+      <w:proofErr w:type="spellEnd"/>
+      <w:r>
+        <w:rPr>
+          <w:rFonts w:eastAsia="Times New Roman" w:cs="Times New Roman"/>
+          <w:color w:val="00000A"/>
+          <w:szCs w:val="24"/>
+          <w:lang w:val="en-US" w:eastAsia="ru-RU"/>
         </w:rPr>
         <w:t xml:space="preserve"> = </w:t>
       </w:r>
@@ -12399,7 +12352,7 @@
           <w:rFonts w:eastAsia="Times New Roman" w:cs="Times New Roman"/>
           <w:color w:val="00000A"/>
           <w:szCs w:val="24"/>
-          <w:lang w:eastAsia="ru-RU"/>
+          <w:lang w:val="en-US" w:eastAsia="ru-RU"/>
         </w:rPr>
         <w:t>(</w:t>
       </w:r>
@@ -12418,7 +12371,7 @@
           <w:rFonts w:eastAsia="Times New Roman" w:cs="Times New Roman"/>
           <w:color w:val="00000A"/>
           <w:szCs w:val="24"/>
-          <w:lang w:eastAsia="ru-RU"/>
+          <w:lang w:val="en-US" w:eastAsia="ru-RU"/>
         </w:rPr>
         <w:t xml:space="preserve">, </w:t>
       </w:r>
@@ -12436,7 +12389,7 @@
           <w:rFonts w:eastAsia="Times New Roman" w:cs="Times New Roman"/>
           <w:color w:val="00000A"/>
           <w:szCs w:val="24"/>
-          <w:lang w:eastAsia="ru-RU"/>
+          <w:lang w:val="en-US" w:eastAsia="ru-RU"/>
         </w:rPr>
         <w:t>);</w:t>
       </w:r>
@@ -12450,7 +12403,7 @@
           <w:rFonts w:eastAsia="Times New Roman" w:cs="Times New Roman"/>
           <w:color w:val="00000A"/>
           <w:szCs w:val="24"/>
-          <w:lang w:eastAsia="ru-RU"/>
+          <w:lang w:val="en-US" w:eastAsia="ru-RU"/>
         </w:rPr>
       </w:pPr>
     </w:p>
@@ -13470,7 +13423,7 @@
           <w:rFonts w:eastAsia="Times New Roman" w:cs="Times New Roman"/>
           <w:color w:val="00000A"/>
           <w:szCs w:val="24"/>
-          <w:lang w:eastAsia="ru-RU"/>
+          <w:lang w:val="en-US" w:eastAsia="ru-RU"/>
         </w:rPr>
       </w:pPr>
       <w:proofErr w:type="gramStart"/>
@@ -13488,7 +13441,7 @@
           <w:rFonts w:eastAsia="Times New Roman" w:cs="Times New Roman"/>
           <w:color w:val="00000A"/>
           <w:szCs w:val="24"/>
-          <w:lang w:eastAsia="ru-RU"/>
+          <w:lang w:val="en-US" w:eastAsia="ru-RU"/>
         </w:rPr>
         <w:t>(</w:t>
       </w:r>
@@ -13498,7 +13451,7 @@
           <w:rFonts w:eastAsia="Times New Roman" w:cs="Times New Roman"/>
           <w:color w:val="00000A"/>
           <w:szCs w:val="24"/>
-          <w:lang w:eastAsia="ru-RU"/>
+          <w:lang w:val="en-US" w:eastAsia="ru-RU"/>
         </w:rPr>
         <w:t>1,3,2);</w:t>
       </w:r>
@@ -14482,7 +14435,7 @@
           <w:rFonts w:eastAsia="Times New Roman" w:cs="Times New Roman"/>
           <w:color w:val="00000A"/>
           <w:szCs w:val="24"/>
-          <w:lang w:val="en-US" w:eastAsia="ru-RU"/>
+          <w:lang w:eastAsia="ru-RU"/>
         </w:rPr>
       </w:pPr>
       <w:proofErr w:type="gramStart"/>
@@ -14494,7 +14447,16 @@
           <w:lang w:val="en-US" w:eastAsia="ru-RU"/>
         </w:rPr>
         <w:lastRenderedPageBreak/>
-        <w:t>title(</w:t>
+        <w:t>title</w:t>
+      </w:r>
+      <w:r>
+        <w:rPr>
+          <w:rFonts w:eastAsia="Times New Roman" w:cs="Times New Roman"/>
+          <w:color w:val="00000A"/>
+          <w:szCs w:val="24"/>
+          <w:lang w:eastAsia="ru-RU"/>
+        </w:rPr>
+        <w:t>(</w:t>
       </w:r>
       <w:proofErr w:type="gramEnd"/>
       <w:r>
@@ -14502,222 +14464,87 @@
           <w:rFonts w:eastAsia="Times New Roman" w:cs="Times New Roman"/>
           <w:color w:val="00000A"/>
           <w:szCs w:val="24"/>
-          <w:lang w:val="en-US" w:eastAsia="ru-RU"/>
-        </w:rPr>
-        <w:t>'</w:t>
-      </w:r>
-      <w:proofErr w:type="spellStart"/>
-      <w:r>
-        <w:rPr>
-          <w:rFonts w:eastAsia="Times New Roman" w:cs="Times New Roman"/>
-          <w:color w:val="00000A"/>
-          <w:szCs w:val="24"/>
-          <w:lang w:val="en-US" w:eastAsia="ru-RU"/>
-        </w:rPr>
-        <w:t>Интерполяция</w:t>
-      </w:r>
-      <w:proofErr w:type="spellEnd"/>
-      <w:r>
-        <w:rPr>
-          <w:rFonts w:eastAsia="Times New Roman" w:cs="Times New Roman"/>
-          <w:color w:val="00000A"/>
-          <w:szCs w:val="24"/>
-          <w:lang w:val="en-US" w:eastAsia="ru-RU"/>
-        </w:rPr>
-        <w:t xml:space="preserve"> </w:t>
-      </w:r>
-      <w:proofErr w:type="spellStart"/>
-      <w:r>
-        <w:rPr>
-          <w:rFonts w:eastAsia="Times New Roman" w:cs="Times New Roman"/>
-          <w:color w:val="00000A"/>
-          <w:szCs w:val="24"/>
-          <w:lang w:val="en-US" w:eastAsia="ru-RU"/>
-        </w:rPr>
-        <w:t>сплайном</w:t>
-      </w:r>
-      <w:proofErr w:type="spellEnd"/>
-      <w:r>
-        <w:rPr>
-          <w:rFonts w:eastAsia="Times New Roman" w:cs="Times New Roman"/>
-          <w:color w:val="00000A"/>
-          <w:szCs w:val="24"/>
-          <w:lang w:val="en-US" w:eastAsia="ru-RU"/>
-        </w:rPr>
-        <w:t xml:space="preserve"> 4-й </w:t>
-      </w:r>
-      <w:proofErr w:type="spellStart"/>
-      <w:r>
-        <w:rPr>
-          <w:rFonts w:eastAsia="Times New Roman" w:cs="Times New Roman"/>
-          <w:color w:val="00000A"/>
-          <w:szCs w:val="24"/>
-          <w:lang w:val="en-US" w:eastAsia="ru-RU"/>
-        </w:rPr>
-        <w:t>степени</w:t>
-      </w:r>
-      <w:proofErr w:type="spellEnd"/>
-      <w:r>
-        <w:rPr>
-          <w:rFonts w:eastAsia="Times New Roman" w:cs="Times New Roman"/>
-          <w:color w:val="00000A"/>
-          <w:szCs w:val="24"/>
-          <w:lang w:val="en-US" w:eastAsia="ru-RU"/>
+          <w:lang w:eastAsia="ru-RU"/>
+        </w:rPr>
+        <w:t>'Интерполяция сплайном 4-й степени');</w:t>
+      </w:r>
+    </w:p>
+    <w:p>
+      <w:pPr>
+        <w:suppressAutoHyphens/>
+        <w:spacing w:after="200" w:line="240" w:lineRule="auto"/>
+        <w:ind w:firstLine="0"/>
+        <w:rPr>
+          <w:rFonts w:eastAsia="Times New Roman" w:cs="Times New Roman"/>
+          <w:color w:val="00000A"/>
+          <w:szCs w:val="24"/>
+          <w:lang w:eastAsia="ru-RU"/>
+        </w:rPr>
+      </w:pPr>
+      <w:proofErr w:type="gramStart"/>
+      <w:r>
+        <w:rPr>
+          <w:rFonts w:eastAsia="Times New Roman" w:cs="Times New Roman"/>
+          <w:color w:val="00000A"/>
+          <w:szCs w:val="24"/>
+          <w:lang w:val="en-US" w:eastAsia="ru-RU"/>
+        </w:rPr>
+        <w:t>legend</w:t>
+      </w:r>
+      <w:r>
+        <w:rPr>
+          <w:rFonts w:eastAsia="Times New Roman" w:cs="Times New Roman"/>
+          <w:color w:val="00000A"/>
+          <w:szCs w:val="24"/>
+          <w:lang w:eastAsia="ru-RU"/>
+        </w:rPr>
+        <w:t>(</w:t>
+      </w:r>
+      <w:proofErr w:type="gramEnd"/>
+      <w:r>
+        <w:rPr>
+          <w:rFonts w:eastAsia="Times New Roman" w:cs="Times New Roman"/>
+          <w:color w:val="00000A"/>
+          <w:szCs w:val="24"/>
+          <w:lang w:eastAsia="ru-RU"/>
+        </w:rPr>
+        <w:t>'Сплайн 4-й степени', 'Узловые точки', 'Интерполируемые точки', '</w:t>
+      </w:r>
+      <w:r>
+        <w:rPr>
+          <w:rFonts w:eastAsia="Times New Roman" w:cs="Times New Roman"/>
+          <w:color w:val="00000A"/>
+          <w:szCs w:val="24"/>
+          <w:lang w:val="en-US" w:eastAsia="ru-RU"/>
+        </w:rPr>
+        <w:t>Location</w:t>
+      </w:r>
+      <w:r>
+        <w:rPr>
+          <w:rFonts w:eastAsia="Times New Roman" w:cs="Times New Roman"/>
+          <w:color w:val="00000A"/>
+          <w:szCs w:val="24"/>
+          <w:lang w:eastAsia="ru-RU"/>
+        </w:rPr>
+        <w:t>', '</w:t>
+      </w:r>
+      <w:r>
+        <w:rPr>
+          <w:rFonts w:eastAsia="Times New Roman" w:cs="Times New Roman"/>
+          <w:color w:val="00000A"/>
+          <w:szCs w:val="24"/>
+          <w:lang w:val="en-US" w:eastAsia="ru-RU"/>
+        </w:rPr>
+        <w:t>best</w:t>
+      </w:r>
+      <w:r>
+        <w:rPr>
+          <w:rFonts w:eastAsia="Times New Roman" w:cs="Times New Roman"/>
+          <w:color w:val="00000A"/>
+          <w:szCs w:val="24"/>
+          <w:lang w:eastAsia="ru-RU"/>
         </w:rPr>
         <w:t>');</w:t>
-      </w:r>
-    </w:p>
-    <w:p>
-      <w:pPr>
-        <w:suppressAutoHyphens/>
-        <w:spacing w:after="200" w:line="240" w:lineRule="auto"/>
-        <w:ind w:firstLine="0"/>
-        <w:rPr>
-          <w:rFonts w:eastAsia="Times New Roman" w:cs="Times New Roman"/>
-          <w:color w:val="00000A"/>
-          <w:szCs w:val="24"/>
-          <w:lang w:val="en-US" w:eastAsia="ru-RU"/>
-        </w:rPr>
-      </w:pPr>
-      <w:proofErr w:type="gramStart"/>
-      <w:r>
-        <w:rPr>
-          <w:rFonts w:eastAsia="Times New Roman" w:cs="Times New Roman"/>
-          <w:color w:val="00000A"/>
-          <w:szCs w:val="24"/>
-          <w:lang w:val="en-US" w:eastAsia="ru-RU"/>
-        </w:rPr>
-        <w:t>legend(</w:t>
-      </w:r>
-      <w:proofErr w:type="gramEnd"/>
-      <w:r>
-        <w:rPr>
-          <w:rFonts w:eastAsia="Times New Roman" w:cs="Times New Roman"/>
-          <w:color w:val="00000A"/>
-          <w:szCs w:val="24"/>
-          <w:lang w:val="en-US" w:eastAsia="ru-RU"/>
-        </w:rPr>
-        <w:t>'</w:t>
-      </w:r>
-      <w:proofErr w:type="spellStart"/>
-      <w:r>
-        <w:rPr>
-          <w:rFonts w:eastAsia="Times New Roman" w:cs="Times New Roman"/>
-          <w:color w:val="00000A"/>
-          <w:szCs w:val="24"/>
-          <w:lang w:val="en-US" w:eastAsia="ru-RU"/>
-        </w:rPr>
-        <w:t>Сплайн</w:t>
-      </w:r>
-      <w:proofErr w:type="spellEnd"/>
-      <w:r>
-        <w:rPr>
-          <w:rFonts w:eastAsia="Times New Roman" w:cs="Times New Roman"/>
-          <w:color w:val="00000A"/>
-          <w:szCs w:val="24"/>
-          <w:lang w:val="en-US" w:eastAsia="ru-RU"/>
-        </w:rPr>
-        <w:t xml:space="preserve"> 4-й </w:t>
-      </w:r>
-      <w:proofErr w:type="spellStart"/>
-      <w:r>
-        <w:rPr>
-          <w:rFonts w:eastAsia="Times New Roman" w:cs="Times New Roman"/>
-          <w:color w:val="00000A"/>
-          <w:szCs w:val="24"/>
-          <w:lang w:val="en-US" w:eastAsia="ru-RU"/>
-        </w:rPr>
-        <w:t>степени</w:t>
-      </w:r>
-      <w:proofErr w:type="spellEnd"/>
-      <w:r>
-        <w:rPr>
-          <w:rFonts w:eastAsia="Times New Roman" w:cs="Times New Roman"/>
-          <w:color w:val="00000A"/>
-          <w:szCs w:val="24"/>
-          <w:lang w:val="en-US" w:eastAsia="ru-RU"/>
-        </w:rPr>
-        <w:t>', '</w:t>
-      </w:r>
-      <w:proofErr w:type="spellStart"/>
-      <w:r>
-        <w:rPr>
-          <w:rFonts w:eastAsia="Times New Roman" w:cs="Times New Roman"/>
-          <w:color w:val="00000A"/>
-          <w:szCs w:val="24"/>
-          <w:lang w:val="en-US" w:eastAsia="ru-RU"/>
-        </w:rPr>
-        <w:t>Узловые</w:t>
-      </w:r>
-      <w:proofErr w:type="spellEnd"/>
-      <w:r>
-        <w:rPr>
-          <w:rFonts w:eastAsia="Times New Roman" w:cs="Times New Roman"/>
-          <w:color w:val="00000A"/>
-          <w:szCs w:val="24"/>
-          <w:lang w:val="en-US" w:eastAsia="ru-RU"/>
-        </w:rPr>
-        <w:t xml:space="preserve"> </w:t>
-      </w:r>
-      <w:proofErr w:type="spellStart"/>
-      <w:r>
-        <w:rPr>
-          <w:rFonts w:eastAsia="Times New Roman" w:cs="Times New Roman"/>
-          <w:color w:val="00000A"/>
-          <w:szCs w:val="24"/>
-          <w:lang w:val="en-US" w:eastAsia="ru-RU"/>
-        </w:rPr>
-        <w:t>точки</w:t>
-      </w:r>
-      <w:proofErr w:type="spellEnd"/>
-      <w:r>
-        <w:rPr>
-          <w:rFonts w:eastAsia="Times New Roman" w:cs="Times New Roman"/>
-          <w:color w:val="00000A"/>
-          <w:szCs w:val="24"/>
-          <w:lang w:val="en-US" w:eastAsia="ru-RU"/>
-        </w:rPr>
-        <w:t>', '</w:t>
-      </w:r>
-      <w:proofErr w:type="spellStart"/>
-      <w:r>
-        <w:rPr>
-          <w:rFonts w:eastAsia="Times New Roman" w:cs="Times New Roman"/>
-          <w:color w:val="00000A"/>
-          <w:szCs w:val="24"/>
-          <w:lang w:val="en-US" w:eastAsia="ru-RU"/>
-        </w:rPr>
-        <w:t>Интерполируемые</w:t>
-      </w:r>
-      <w:proofErr w:type="spellEnd"/>
-      <w:r>
-        <w:rPr>
-          <w:rFonts w:eastAsia="Times New Roman" w:cs="Times New Roman"/>
-          <w:color w:val="00000A"/>
-          <w:szCs w:val="24"/>
-          <w:lang w:val="en-US" w:eastAsia="ru-RU"/>
-        </w:rPr>
-        <w:t xml:space="preserve"> </w:t>
-      </w:r>
-      <w:proofErr w:type="spellStart"/>
-      <w:r>
-        <w:rPr>
-          <w:rFonts w:eastAsia="Times New Roman" w:cs="Times New Roman"/>
-          <w:color w:val="00000A"/>
-          <w:szCs w:val="24"/>
-          <w:lang w:val="en-US" w:eastAsia="ru-RU"/>
-        </w:rPr>
-        <w:t>точки</w:t>
-      </w:r>
-      <w:proofErr w:type="spellEnd"/>
-      <w:r>
-        <w:rPr>
-          <w:rFonts w:eastAsia="Times New Roman" w:cs="Times New Roman"/>
-          <w:color w:val="00000A"/>
-          <w:szCs w:val="24"/>
-          <w:lang w:val="en-US" w:eastAsia="ru-RU"/>
-        </w:rPr>
-        <w:t>', 'Location', 'best');</w:t>
       </w:r>
     </w:p>
     <w:p>
@@ -20216,6 +20043,7 @@
   <w:style w:type="character" w:default="1" w:styleId="a0">
     <w:name w:val="Default Paragraph Font"/>
     <w:uiPriority w:val="1"/>
+    <w:semiHidden/>
     <w:unhideWhenUsed/>
   </w:style>
   <w:style w:type="table" w:default="1" w:styleId="a1">

</xml_diff>